<commit_message>
Upd: log sprint 4
</commit_message>
<xml_diff>
--- a/Templates/Log/Wassink_Log.docx
+++ b/Templates/Log/Wassink_Log.docx
@@ -2715,6 +2715,7 @@
         <w:rPr>
           <w:i/>
           <w:iCs/>
+          <w:noProof/>
         </w:rPr>
         <w:drawing>
           <wp:inline distT="0" distB="0" distL="0" distR="0" wp14:anchorId="4175F4EB" wp14:editId="3CF85FFF">
@@ -2768,6 +2769,7 @@
         <w:rPr>
           <w:i/>
           <w:iCs/>
+          <w:noProof/>
         </w:rPr>
         <w:drawing>
           <wp:inline distT="0" distB="0" distL="0" distR="0" wp14:anchorId="595A9BAD" wp14:editId="73CCFBE2">
@@ -2821,6 +2823,7 @@
         <w:rPr>
           <w:i/>
           <w:iCs/>
+          <w:noProof/>
         </w:rPr>
         <w:drawing>
           <wp:inline distT="0" distB="0" distL="0" distR="0" wp14:anchorId="08EEC841" wp14:editId="19FEC7C0">
@@ -2874,6 +2877,7 @@
         <w:rPr>
           <w:i/>
           <w:iCs/>
+          <w:noProof/>
         </w:rPr>
         <w:lastRenderedPageBreak/>
         <w:drawing>
@@ -2928,6 +2932,7 @@
         <w:rPr>
           <w:i/>
           <w:iCs/>
+          <w:noProof/>
         </w:rPr>
         <w:drawing>
           <wp:inline distT="0" distB="0" distL="0" distR="0" wp14:anchorId="65919C26" wp14:editId="2C94C8E2">
@@ -2981,6 +2986,7 @@
         <w:rPr>
           <w:i/>
           <w:iCs/>
+          <w:noProof/>
         </w:rPr>
         <w:drawing>
           <wp:inline distT="0" distB="0" distL="0" distR="0" wp14:anchorId="1561B76B" wp14:editId="147401CB">
@@ -3034,6 +3040,7 @@
         <w:rPr>
           <w:i/>
           <w:iCs/>
+          <w:noProof/>
         </w:rPr>
         <w:lastRenderedPageBreak/>
         <w:drawing>
@@ -3088,6 +3095,7 @@
         <w:rPr>
           <w:i/>
           <w:iCs/>
+          <w:noProof/>
         </w:rPr>
         <w:drawing>
           <wp:inline distT="0" distB="0" distL="0" distR="0" wp14:anchorId="6C9DE1BA" wp14:editId="72AF7054">
@@ -3508,9 +3516,12 @@
       <w:bookmarkStart w:id="2" w:name="_Toc182471798"/>
       <w:r>
         <w:lastRenderedPageBreak/>
-        <w:t>Sprint 3</w:t>
+        <w:t xml:space="preserve">Sprint </w:t>
       </w:r>
       <w:bookmarkEnd w:id="2"/>
+      <w:r>
+        <w:t>4</w:t>
+      </w:r>
     </w:p>
     <w:p>
       <w:pPr>
@@ -3581,8 +3592,466 @@
           <w:i/>
           <w:iCs/>
         </w:rPr>
-        <w:t>…</w:t>
-      </w:r>
+        <w:drawing>
+          <wp:inline distT="0" distB="0" distL="0" distR="0" wp14:anchorId="4319FD62" wp14:editId="65CD7761">
+            <wp:extent cx="2437200" cy="2944800"/>
+            <wp:effectExtent l="0" t="0" r="1270" b="8255"/>
+            <wp:docPr id="290032241" name="Afbeelding 1" descr="Afbeelding met tekst, schermopname, Lettertype&#10;&#10;Door AI gegenereerde inhoud is mogelijk onjuist."/>
+            <wp:cNvGraphicFramePr>
+              <a:graphicFrameLocks xmlns:a="http://schemas.openxmlformats.org/drawingml/2006/main" noChangeAspect="1"/>
+            </wp:cNvGraphicFramePr>
+            <a:graphic xmlns:a="http://schemas.openxmlformats.org/drawingml/2006/main">
+              <a:graphicData uri="http://schemas.openxmlformats.org/drawingml/2006/picture">
+                <pic:pic xmlns:pic="http://schemas.openxmlformats.org/drawingml/2006/picture">
+                  <pic:nvPicPr>
+                    <pic:cNvPr id="290032241" name="Afbeelding 1" descr="Afbeelding met tekst, schermopname, Lettertype&#10;&#10;Door AI gegenereerde inhoud is mogelijk onjuist."/>
+                    <pic:cNvPicPr/>
+                  </pic:nvPicPr>
+                  <pic:blipFill>
+                    <a:blip r:embed="rId37">
+                      <a:extLst>
+                        <a:ext uri="{28A0092B-C50C-407E-A947-70E740481C1C}">
+                          <a14:useLocalDpi xmlns:a14="http://schemas.microsoft.com/office/drawing/2010/main" val="0"/>
+                        </a:ext>
+                      </a:extLst>
+                    </a:blip>
+                    <a:stretch>
+                      <a:fillRect/>
+                    </a:stretch>
+                  </pic:blipFill>
+                  <pic:spPr>
+                    <a:xfrm>
+                      <a:off x="0" y="0"/>
+                      <a:ext cx="2437200" cy="2944800"/>
+                    </a:xfrm>
+                    <a:prstGeom prst="rect">
+                      <a:avLst/>
+                    </a:prstGeom>
+                  </pic:spPr>
+                </pic:pic>
+              </a:graphicData>
+            </a:graphic>
+          </wp:inline>
+        </w:drawing>
+      </w:r>
+    </w:p>
+    <w:p>
+      <w:pPr>
+        <w:pStyle w:val="Lijstalinea"/>
+        <w:ind w:left="360"/>
+      </w:pPr>
+    </w:p>
+    <w:p>
+      <w:pPr>
+        <w:pStyle w:val="Lijstalinea"/>
+        <w:ind w:left="360"/>
+      </w:pPr>
+      <w:r>
+        <w:rPr>
+          <w:i/>
+          <w:iCs/>
+        </w:rPr>
+        <w:drawing>
+          <wp:inline distT="0" distB="0" distL="0" distR="0" wp14:anchorId="05CC26EC" wp14:editId="532B9464">
+            <wp:extent cx="3534268" cy="2191056"/>
+            <wp:effectExtent l="0" t="0" r="0" b="0"/>
+            <wp:docPr id="1099816326" name="Afbeelding 1" descr="Afbeelding met tekst, schermopname, Lettertype&#10;&#10;Door AI gegenereerde inhoud is mogelijk onjuist."/>
+            <wp:cNvGraphicFramePr>
+              <a:graphicFrameLocks xmlns:a="http://schemas.openxmlformats.org/drawingml/2006/main" noChangeAspect="1"/>
+            </wp:cNvGraphicFramePr>
+            <a:graphic xmlns:a="http://schemas.openxmlformats.org/drawingml/2006/main">
+              <a:graphicData uri="http://schemas.openxmlformats.org/drawingml/2006/picture">
+                <pic:pic xmlns:pic="http://schemas.openxmlformats.org/drawingml/2006/picture">
+                  <pic:nvPicPr>
+                    <pic:cNvPr id="1099816326" name="Afbeelding 1" descr="Afbeelding met tekst, schermopname, Lettertype&#10;&#10;Door AI gegenereerde inhoud is mogelijk onjuist."/>
+                    <pic:cNvPicPr/>
+                  </pic:nvPicPr>
+                  <pic:blipFill>
+                    <a:blip r:embed="rId38">
+                      <a:extLst>
+                        <a:ext uri="{28A0092B-C50C-407E-A947-70E740481C1C}">
+                          <a14:useLocalDpi xmlns:a14="http://schemas.microsoft.com/office/drawing/2010/main" val="0"/>
+                        </a:ext>
+                      </a:extLst>
+                    </a:blip>
+                    <a:stretch>
+                      <a:fillRect/>
+                    </a:stretch>
+                  </pic:blipFill>
+                  <pic:spPr>
+                    <a:xfrm>
+                      <a:off x="0" y="0"/>
+                      <a:ext cx="3534268" cy="2191056"/>
+                    </a:xfrm>
+                    <a:prstGeom prst="rect">
+                      <a:avLst/>
+                    </a:prstGeom>
+                  </pic:spPr>
+                </pic:pic>
+              </a:graphicData>
+            </a:graphic>
+          </wp:inline>
+        </w:drawing>
+      </w:r>
+    </w:p>
+    <w:p>
+      <w:pPr>
+        <w:pStyle w:val="Lijstalinea"/>
+        <w:ind w:left="360"/>
+      </w:pPr>
+      <w:r>
+        <w:rPr>
+          <w:i/>
+          <w:iCs/>
+        </w:rPr>
+        <w:drawing>
+          <wp:inline distT="0" distB="0" distL="0" distR="0" wp14:anchorId="3ACC56C8" wp14:editId="2084EE55">
+            <wp:extent cx="5760720" cy="2195830"/>
+            <wp:effectExtent l="0" t="0" r="0" b="0"/>
+            <wp:docPr id="1614733742" name="Afbeelding 1" descr="Afbeelding met tekst, schermopname, Lettertype&#10;&#10;Door AI gegenereerde inhoud is mogelijk onjuist."/>
+            <wp:cNvGraphicFramePr>
+              <a:graphicFrameLocks xmlns:a="http://schemas.openxmlformats.org/drawingml/2006/main" noChangeAspect="1"/>
+            </wp:cNvGraphicFramePr>
+            <a:graphic xmlns:a="http://schemas.openxmlformats.org/drawingml/2006/main">
+              <a:graphicData uri="http://schemas.openxmlformats.org/drawingml/2006/picture">
+                <pic:pic xmlns:pic="http://schemas.openxmlformats.org/drawingml/2006/picture">
+                  <pic:nvPicPr>
+                    <pic:cNvPr id="1614733742" name="Afbeelding 1" descr="Afbeelding met tekst, schermopname, Lettertype&#10;&#10;Door AI gegenereerde inhoud is mogelijk onjuist."/>
+                    <pic:cNvPicPr/>
+                  </pic:nvPicPr>
+                  <pic:blipFill>
+                    <a:blip r:embed="rId39">
+                      <a:extLst>
+                        <a:ext uri="{28A0092B-C50C-407E-A947-70E740481C1C}">
+                          <a14:useLocalDpi xmlns:a14="http://schemas.microsoft.com/office/drawing/2010/main" val="0"/>
+                        </a:ext>
+                      </a:extLst>
+                    </a:blip>
+                    <a:stretch>
+                      <a:fillRect/>
+                    </a:stretch>
+                  </pic:blipFill>
+                  <pic:spPr>
+                    <a:xfrm>
+                      <a:off x="0" y="0"/>
+                      <a:ext cx="5760720" cy="2195830"/>
+                    </a:xfrm>
+                    <a:prstGeom prst="rect">
+                      <a:avLst/>
+                    </a:prstGeom>
+                  </pic:spPr>
+                </pic:pic>
+              </a:graphicData>
+            </a:graphic>
+          </wp:inline>
+        </w:drawing>
+      </w:r>
+    </w:p>
+    <w:p>
+      <w:pPr>
+        <w:pStyle w:val="Lijstalinea"/>
+        <w:ind w:left="360"/>
+      </w:pPr>
+      <w:r>
+        <w:rPr>
+          <w:i/>
+          <w:iCs/>
+        </w:rPr>
+        <w:lastRenderedPageBreak/>
+        <w:drawing>
+          <wp:inline distT="0" distB="0" distL="0" distR="0" wp14:anchorId="35D68EB9" wp14:editId="4D6CE7CA">
+            <wp:extent cx="5760720" cy="2476500"/>
+            <wp:effectExtent l="0" t="0" r="0" b="0"/>
+            <wp:docPr id="711817918" name="Afbeelding 1" descr="Afbeelding met tekst, schermopname, Lettertype&#10;&#10;Door AI gegenereerde inhoud is mogelijk onjuist."/>
+            <wp:cNvGraphicFramePr>
+              <a:graphicFrameLocks xmlns:a="http://schemas.openxmlformats.org/drawingml/2006/main" noChangeAspect="1"/>
+            </wp:cNvGraphicFramePr>
+            <a:graphic xmlns:a="http://schemas.openxmlformats.org/drawingml/2006/main">
+              <a:graphicData uri="http://schemas.openxmlformats.org/drawingml/2006/picture">
+                <pic:pic xmlns:pic="http://schemas.openxmlformats.org/drawingml/2006/picture">
+                  <pic:nvPicPr>
+                    <pic:cNvPr id="711817918" name="Afbeelding 1" descr="Afbeelding met tekst, schermopname, Lettertype&#10;&#10;Door AI gegenereerde inhoud is mogelijk onjuist."/>
+                    <pic:cNvPicPr/>
+                  </pic:nvPicPr>
+                  <pic:blipFill>
+                    <a:blip r:embed="rId40">
+                      <a:extLst>
+                        <a:ext uri="{28A0092B-C50C-407E-A947-70E740481C1C}">
+                          <a14:useLocalDpi xmlns:a14="http://schemas.microsoft.com/office/drawing/2010/main" val="0"/>
+                        </a:ext>
+                      </a:extLst>
+                    </a:blip>
+                    <a:stretch>
+                      <a:fillRect/>
+                    </a:stretch>
+                  </pic:blipFill>
+                  <pic:spPr>
+                    <a:xfrm>
+                      <a:off x="0" y="0"/>
+                      <a:ext cx="5760720" cy="2476500"/>
+                    </a:xfrm>
+                    <a:prstGeom prst="rect">
+                      <a:avLst/>
+                    </a:prstGeom>
+                  </pic:spPr>
+                </pic:pic>
+              </a:graphicData>
+            </a:graphic>
+          </wp:inline>
+        </w:drawing>
+      </w:r>
+    </w:p>
+    <w:p>
+      <w:pPr>
+        <w:pStyle w:val="Lijstalinea"/>
+        <w:ind w:left="360"/>
+      </w:pPr>
+      <w:r>
+        <w:drawing>
+          <wp:inline distT="0" distB="0" distL="0" distR="0" wp14:anchorId="34ED643E" wp14:editId="1ED16456">
+            <wp:extent cx="3534268" cy="2676899"/>
+            <wp:effectExtent l="0" t="0" r="0" b="9525"/>
+            <wp:docPr id="1889503621" name="Afbeelding 1" descr="Afbeelding met tekst, schermopname, Lettertype&#10;&#10;Door AI gegenereerde inhoud is mogelijk onjuist."/>
+            <wp:cNvGraphicFramePr>
+              <a:graphicFrameLocks xmlns:a="http://schemas.openxmlformats.org/drawingml/2006/main" noChangeAspect="1"/>
+            </wp:cNvGraphicFramePr>
+            <a:graphic xmlns:a="http://schemas.openxmlformats.org/drawingml/2006/main">
+              <a:graphicData uri="http://schemas.openxmlformats.org/drawingml/2006/picture">
+                <pic:pic xmlns:pic="http://schemas.openxmlformats.org/drawingml/2006/picture">
+                  <pic:nvPicPr>
+                    <pic:cNvPr id="1889503621" name="Afbeelding 1" descr="Afbeelding met tekst, schermopname, Lettertype&#10;&#10;Door AI gegenereerde inhoud is mogelijk onjuist."/>
+                    <pic:cNvPicPr/>
+                  </pic:nvPicPr>
+                  <pic:blipFill>
+                    <a:blip r:embed="rId41">
+                      <a:extLst>
+                        <a:ext uri="{28A0092B-C50C-407E-A947-70E740481C1C}">
+                          <a14:useLocalDpi xmlns:a14="http://schemas.microsoft.com/office/drawing/2010/main" val="0"/>
+                        </a:ext>
+                      </a:extLst>
+                    </a:blip>
+                    <a:stretch>
+                      <a:fillRect/>
+                    </a:stretch>
+                  </pic:blipFill>
+                  <pic:spPr>
+                    <a:xfrm>
+                      <a:off x="0" y="0"/>
+                      <a:ext cx="3534268" cy="2676899"/>
+                    </a:xfrm>
+                    <a:prstGeom prst="rect">
+                      <a:avLst/>
+                    </a:prstGeom>
+                  </pic:spPr>
+                </pic:pic>
+              </a:graphicData>
+            </a:graphic>
+          </wp:inline>
+        </w:drawing>
+      </w:r>
+    </w:p>
+    <w:p>
+      <w:pPr>
+        <w:pStyle w:val="Lijstalinea"/>
+        <w:ind w:left="360"/>
+      </w:pPr>
+      <w:r>
+        <w:drawing>
+          <wp:inline distT="0" distB="0" distL="0" distR="0" wp14:anchorId="4F822B92" wp14:editId="637A9BAC">
+            <wp:extent cx="4086225" cy="2381250"/>
+            <wp:effectExtent l="0" t="0" r="9525" b="0"/>
+            <wp:docPr id="720905624" name="Afbeelding 1" descr="Afbeelding met tekst, schermopname, Lettertype&#10;&#10;Door AI gegenereerde inhoud is mogelijk onjuist."/>
+            <wp:cNvGraphicFramePr>
+              <a:graphicFrameLocks xmlns:a="http://schemas.openxmlformats.org/drawingml/2006/main" noChangeAspect="1"/>
+            </wp:cNvGraphicFramePr>
+            <a:graphic xmlns:a="http://schemas.openxmlformats.org/drawingml/2006/main">
+              <a:graphicData uri="http://schemas.openxmlformats.org/drawingml/2006/picture">
+                <pic:pic xmlns:pic="http://schemas.openxmlformats.org/drawingml/2006/picture">
+                  <pic:nvPicPr>
+                    <pic:cNvPr id="720905624" name="Afbeelding 1" descr="Afbeelding met tekst, schermopname, Lettertype&#10;&#10;Door AI gegenereerde inhoud is mogelijk onjuist."/>
+                    <pic:cNvPicPr/>
+                  </pic:nvPicPr>
+                  <pic:blipFill>
+                    <a:blip r:embed="rId42">
+                      <a:extLst>
+                        <a:ext uri="{28A0092B-C50C-407E-A947-70E740481C1C}">
+                          <a14:useLocalDpi xmlns:a14="http://schemas.microsoft.com/office/drawing/2010/main" val="0"/>
+                        </a:ext>
+                      </a:extLst>
+                    </a:blip>
+                    <a:stretch>
+                      <a:fillRect/>
+                    </a:stretch>
+                  </pic:blipFill>
+                  <pic:spPr>
+                    <a:xfrm>
+                      <a:off x="0" y="0"/>
+                      <a:ext cx="4086225" cy="2381250"/>
+                    </a:xfrm>
+                    <a:prstGeom prst="rect">
+                      <a:avLst/>
+                    </a:prstGeom>
+                  </pic:spPr>
+                </pic:pic>
+              </a:graphicData>
+            </a:graphic>
+          </wp:inline>
+        </w:drawing>
+      </w:r>
+    </w:p>
+    <w:p>
+      <w:pPr>
+        <w:pStyle w:val="Lijstalinea"/>
+        <w:ind w:left="360"/>
+      </w:pPr>
+      <w:r>
+        <w:lastRenderedPageBreak/>
+        <w:drawing>
+          <wp:inline distT="0" distB="0" distL="0" distR="0" wp14:anchorId="7C82A718" wp14:editId="7413279C">
+            <wp:extent cx="2762636" cy="2391109"/>
+            <wp:effectExtent l="0" t="0" r="0" b="9525"/>
+            <wp:docPr id="647941282" name="Afbeelding 1" descr="Afbeelding met tekst, schermopname, Lettertype&#10;&#10;Door AI gegenereerde inhoud is mogelijk onjuist."/>
+            <wp:cNvGraphicFramePr>
+              <a:graphicFrameLocks xmlns:a="http://schemas.openxmlformats.org/drawingml/2006/main" noChangeAspect="1"/>
+            </wp:cNvGraphicFramePr>
+            <a:graphic xmlns:a="http://schemas.openxmlformats.org/drawingml/2006/main">
+              <a:graphicData uri="http://schemas.openxmlformats.org/drawingml/2006/picture">
+                <pic:pic xmlns:pic="http://schemas.openxmlformats.org/drawingml/2006/picture">
+                  <pic:nvPicPr>
+                    <pic:cNvPr id="647941282" name="Afbeelding 1" descr="Afbeelding met tekst, schermopname, Lettertype&#10;&#10;Door AI gegenereerde inhoud is mogelijk onjuist."/>
+                    <pic:cNvPicPr/>
+                  </pic:nvPicPr>
+                  <pic:blipFill>
+                    <a:blip r:embed="rId43">
+                      <a:extLst>
+                        <a:ext uri="{28A0092B-C50C-407E-A947-70E740481C1C}">
+                          <a14:useLocalDpi xmlns:a14="http://schemas.microsoft.com/office/drawing/2010/main" val="0"/>
+                        </a:ext>
+                      </a:extLst>
+                    </a:blip>
+                    <a:stretch>
+                      <a:fillRect/>
+                    </a:stretch>
+                  </pic:blipFill>
+                  <pic:spPr>
+                    <a:xfrm>
+                      <a:off x="0" y="0"/>
+                      <a:ext cx="2762636" cy="2391109"/>
+                    </a:xfrm>
+                    <a:prstGeom prst="rect">
+                      <a:avLst/>
+                    </a:prstGeom>
+                  </pic:spPr>
+                </pic:pic>
+              </a:graphicData>
+            </a:graphic>
+          </wp:inline>
+        </w:drawing>
+      </w:r>
+    </w:p>
+    <w:p>
+      <w:pPr>
+        <w:pStyle w:val="Lijstalinea"/>
+        <w:ind w:left="360"/>
+      </w:pPr>
+      <w:r>
+        <w:drawing>
+          <wp:inline distT="0" distB="0" distL="0" distR="0" wp14:anchorId="1CEE6709" wp14:editId="3B1A413D">
+            <wp:extent cx="3658111" cy="2229161"/>
+            <wp:effectExtent l="0" t="0" r="0" b="0"/>
+            <wp:docPr id="954976379" name="Afbeelding 1" descr="Afbeelding met tekst, schermopname, Lettertype&#10;&#10;Door AI gegenereerde inhoud is mogelijk onjuist."/>
+            <wp:cNvGraphicFramePr>
+              <a:graphicFrameLocks xmlns:a="http://schemas.openxmlformats.org/drawingml/2006/main" noChangeAspect="1"/>
+            </wp:cNvGraphicFramePr>
+            <a:graphic xmlns:a="http://schemas.openxmlformats.org/drawingml/2006/main">
+              <a:graphicData uri="http://schemas.openxmlformats.org/drawingml/2006/picture">
+                <pic:pic xmlns:pic="http://schemas.openxmlformats.org/drawingml/2006/picture">
+                  <pic:nvPicPr>
+                    <pic:cNvPr id="954976379" name="Afbeelding 1" descr="Afbeelding met tekst, schermopname, Lettertype&#10;&#10;Door AI gegenereerde inhoud is mogelijk onjuist."/>
+                    <pic:cNvPicPr/>
+                  </pic:nvPicPr>
+                  <pic:blipFill>
+                    <a:blip r:embed="rId44">
+                      <a:extLst>
+                        <a:ext uri="{28A0092B-C50C-407E-A947-70E740481C1C}">
+                          <a14:useLocalDpi xmlns:a14="http://schemas.microsoft.com/office/drawing/2010/main" val="0"/>
+                        </a:ext>
+                      </a:extLst>
+                    </a:blip>
+                    <a:stretch>
+                      <a:fillRect/>
+                    </a:stretch>
+                  </pic:blipFill>
+                  <pic:spPr>
+                    <a:xfrm>
+                      <a:off x="0" y="0"/>
+                      <a:ext cx="3658111" cy="2229161"/>
+                    </a:xfrm>
+                    <a:prstGeom prst="rect">
+                      <a:avLst/>
+                    </a:prstGeom>
+                  </pic:spPr>
+                </pic:pic>
+              </a:graphicData>
+            </a:graphic>
+          </wp:inline>
+        </w:drawing>
+      </w:r>
+    </w:p>
+    <w:p>
+      <w:pPr>
+        <w:pStyle w:val="Lijstalinea"/>
+        <w:ind w:left="360"/>
+      </w:pPr>
+      <w:r>
+        <w:drawing>
+          <wp:inline distT="0" distB="0" distL="0" distR="0" wp14:anchorId="62AAA342" wp14:editId="4F40381B">
+            <wp:extent cx="2152950" cy="2324424"/>
+            <wp:effectExtent l="0" t="0" r="0" b="0"/>
+            <wp:docPr id="1908811026" name="Afbeelding 1" descr="Afbeelding met tekst, schermopname, Lettertype&#10;&#10;Door AI gegenereerde inhoud is mogelijk onjuist."/>
+            <wp:cNvGraphicFramePr>
+              <a:graphicFrameLocks xmlns:a="http://schemas.openxmlformats.org/drawingml/2006/main" noChangeAspect="1"/>
+            </wp:cNvGraphicFramePr>
+            <a:graphic xmlns:a="http://schemas.openxmlformats.org/drawingml/2006/main">
+              <a:graphicData uri="http://schemas.openxmlformats.org/drawingml/2006/picture">
+                <pic:pic xmlns:pic="http://schemas.openxmlformats.org/drawingml/2006/picture">
+                  <pic:nvPicPr>
+                    <pic:cNvPr id="1908811026" name="Afbeelding 1" descr="Afbeelding met tekst, schermopname, Lettertype&#10;&#10;Door AI gegenereerde inhoud is mogelijk onjuist."/>
+                    <pic:cNvPicPr/>
+                  </pic:nvPicPr>
+                  <pic:blipFill>
+                    <a:blip r:embed="rId45">
+                      <a:extLst>
+                        <a:ext uri="{28A0092B-C50C-407E-A947-70E740481C1C}">
+                          <a14:useLocalDpi xmlns:a14="http://schemas.microsoft.com/office/drawing/2010/main" val="0"/>
+                        </a:ext>
+                      </a:extLst>
+                    </a:blip>
+                    <a:stretch>
+                      <a:fillRect/>
+                    </a:stretch>
+                  </pic:blipFill>
+                  <pic:spPr>
+                    <a:xfrm>
+                      <a:off x="0" y="0"/>
+                      <a:ext cx="2152950" cy="2324424"/>
+                    </a:xfrm>
+                    <a:prstGeom prst="rect">
+                      <a:avLst/>
+                    </a:prstGeom>
+                  </pic:spPr>
+                </pic:pic>
+              </a:graphicData>
+            </a:graphic>
+          </wp:inline>
+        </w:drawing>
+      </w:r>
+    </w:p>
+    <w:p>
+      <w:pPr>
+        <w:pStyle w:val="Lijstalinea"/>
+        <w:ind w:left="360"/>
+      </w:pPr>
       <w:r>
         <w:rPr>
           <w:i/>
@@ -3618,7 +4087,7 @@
           <w:b/>
           <w:bCs/>
         </w:rPr>
-        <w:t>3</w:t>
+        <w:t>4</w:t>
       </w:r>
       <w:r>
         <w:rPr>
@@ -3633,22 +4102,19 @@
           <w:bCs/>
         </w:rPr>
         <w:br/>
+      </w:r>
+      <w:r>
+        <w:t>In sprint 4 hebben we best wat dingen af gekregen zoals: overige obstakels die we nodig hadden gemaakt, verder bezig geweest met debuffs, leaderboard gemaakt zodat spelers kunnen zien we voor staat en wie ze zijn.</w:t>
       </w:r>
       <w:r>
         <w:rPr>
           <w:i/>
           <w:iCs/>
         </w:rPr>
-        <w:t>…</w:t>
-      </w:r>
-      <w:r>
-        <w:rPr>
-          <w:i/>
-          <w:iCs/>
-        </w:rPr>
         <w:br/>
       </w:r>
     </w:p>
+    <w:p/>
     <w:p>
       <w:pPr>
         <w:pStyle w:val="Lijstalinea"/>
@@ -3662,6 +4128,7 @@
           <w:b/>
           <w:bCs/>
         </w:rPr>
+        <w:lastRenderedPageBreak/>
         <w:t>Beschrijf mogelijke uitdagingen, obstakels en als die er zijn oplossing(en).</w:t>
       </w:r>
       <w:r>
@@ -3672,11 +4139,7 @@
         <w:br/>
       </w:r>
       <w:r>
-        <w:rPr>
-          <w:i/>
-          <w:iCs/>
-        </w:rPr>
-        <w:t>…</w:t>
+        <w:t>Wij hadden aan het eind van de sprint toen we wouden testen wat problemen met functies die niet goed zelf getest zijn waardoor het niet werkte toen we het wouden laten testen. Om dit later te vermijden moeten we beter gaan testen met meerdere spelers en in de huidige test scene.</w:t>
       </w:r>
       <w:r>
         <w:rPr>
@@ -3709,11 +4172,7 @@
         <w:br/>
       </w:r>
       <w:r>
-        <w:rPr>
-          <w:i/>
-          <w:iCs/>
-        </w:rPr>
-        <w:t>…</w:t>
+        <w:t>ik heb deze sprint niet echt nieuwe dingen geleerd.</w:t>
       </w:r>
       <w:r>
         <w:rPr>
@@ -3746,11 +4205,7 @@
         <w:br/>
       </w:r>
       <w:r>
-        <w:rPr>
-          <w:i/>
-          <w:iCs/>
-        </w:rPr>
-        <w:t>…</w:t>
+        <w:t>Geen vragen/onduidelijkheden</w:t>
       </w:r>
       <w:r>
         <w:rPr>
@@ -3807,11 +4262,7 @@
         <w:br/>
       </w:r>
       <w:r>
-        <w:rPr>
-          <w:i/>
-          <w:iCs/>
-        </w:rPr>
-        <w:t>…</w:t>
+        <w:t>Feedback wat ik aan mijn groepje (en mezelf) geef is om meer dingen te testen met meerdere spelers omdat ik vaak genoeg heb gehad dat een functie goed werkt tot je met meerdere spelers gaat spelen.</w:t>
       </w:r>
       <w:r>
         <w:rPr>
@@ -3862,11 +4313,7 @@
         <w:br/>
       </w:r>
       <w:r>
-        <w:rPr>
-          <w:i/>
-          <w:iCs/>
-        </w:rPr>
-        <w:t>…</w:t>
+        <w:t>beter dingen testen.</w:t>
       </w:r>
       <w:r>
         <w:rPr>
@@ -3899,11 +4346,7 @@
         <w:br/>
       </w:r>
       <w:r>
-        <w:rPr>
-          <w:i/>
-          <w:iCs/>
-        </w:rPr>
-        <w:t>…</w:t>
+        <w:t>Goed</w:t>
       </w:r>
       <w:r>
         <w:rPr>
@@ -3940,7 +4383,19 @@
         <w:br/>
       </w:r>
       <w:r>
-        <w:t>…</w:t>
+        <w:t>Punten Systeem</w:t>
+      </w:r>
+      <w:r>
+        <w:br/>
+        <w:t xml:space="preserve">Doorgaan bij winnen </w:t>
+      </w:r>
+      <w:r>
+        <w:br/>
+        <w:t>Debuffs goed af</w:t>
+      </w:r>
+      <w:r>
+        <w:br/>
+        <w:t>Obstakels gefixt</w:t>
       </w:r>
     </w:p>
     <w:p>
@@ -4392,9 +4847,9 @@
       </w:pPr>
     </w:p>
     <w:sectPr>
-      <w:footerReference w:type="default" r:id="rId37"/>
-      <w:headerReference w:type="first" r:id="rId38"/>
-      <w:footerReference w:type="first" r:id="rId39"/>
+      <w:footerReference w:type="default" r:id="rId46"/>
+      <w:headerReference w:type="first" r:id="rId47"/>
+      <w:footerReference w:type="first" r:id="rId48"/>
       <w:pgSz w:w="11906" w:h="16838"/>
       <w:pgMar w:top="1417" w:right="1417" w:bottom="1417" w:left="1417" w:header="708" w:footer="708" w:gutter="0"/>
       <w:cols w:space="708"/>
@@ -9947,6 +10402,10 @@
 </file>
 
 <file path=customXml/item1.xml><?xml version="1.0" encoding="utf-8"?>
+<b:Sources xmlns:b="http://schemas.openxmlformats.org/officeDocument/2006/bibliography" xmlns="http://schemas.openxmlformats.org/officeDocument/2006/bibliography" SelectedStyle="\APASixthEditionOfficeOnline.xsl" StyleName="APA" Version="6"/>
+</file>
+
+<file path=customXml/item2.xml><?xml version="1.0" encoding="utf-8"?>
 <p:properties xmlns:p="http://schemas.microsoft.com/office/2006/metadata/properties" xmlns:xsi="http://www.w3.org/2001/XMLSchema-instance" xmlns:pc="http://schemas.microsoft.com/office/infopath/2007/PartnerControls">
   <documentManagement>
     <TaxCatchAll xmlns="32dd6115-ce5d-46b4-b638-9e7d5ca6cbee" xsi:nil="true"/>
@@ -9957,20 +10416,7 @@
 </p:properties>
 </file>
 
-<file path=customXml/item2.xml><?xml version="1.0" encoding="utf-8"?>
-<b:Sources xmlns:b="http://schemas.openxmlformats.org/officeDocument/2006/bibliography" xmlns="http://schemas.openxmlformats.org/officeDocument/2006/bibliography" SelectedStyle="\APASixthEditionOfficeOnline.xsl" StyleName="APA" Version="6"/>
-</file>
-
 <file path=customXml/item3.xml><?xml version="1.0" encoding="utf-8"?>
-<?mso-contentType ?>
-<FormTemplates xmlns="http://schemas.microsoft.com/sharepoint/v3/contenttype/forms">
-  <Display>DocumentLibraryForm</Display>
-  <Edit>DocumentLibraryForm</Edit>
-  <New>DocumentLibraryForm</New>
-</FormTemplates>
-</file>
-
-<file path=customXml/item4.xml><?xml version="1.0" encoding="utf-8"?>
 <ct:contentTypeSchema xmlns:ct="http://schemas.microsoft.com/office/2006/metadata/contentType" xmlns:ma="http://schemas.microsoft.com/office/2006/metadata/properties/metaAttributes" ct:_="" ma:_="" ma:contentTypeName="Document" ma:contentTypeID="0x010100D5188FA4F7421B4A93E65E307A769E27" ma:contentTypeVersion="15" ma:contentTypeDescription="Een nieuw document maken." ma:contentTypeScope="" ma:versionID="9bfd002f47f5f7e7b2724518f3fad1a5">
   <xsd:schema xmlns:xsd="http://www.w3.org/2001/XMLSchema" xmlns:xs="http://www.w3.org/2001/XMLSchema" xmlns:p="http://schemas.microsoft.com/office/2006/metadata/properties" xmlns:ns2="094ecc41-7a37-40c9-8390-f18431712098" xmlns:ns3="32dd6115-ce5d-46b4-b638-9e7d5ca6cbee" targetNamespace="http://schemas.microsoft.com/office/2006/metadata/properties" ma:root="true" ma:fieldsID="e2c1118370456e9a6d2939e9bd0f2e89" ns2:_="" ns3:_="">
     <xsd:import namespace="094ecc41-7a37-40c9-8390-f18431712098"/>
@@ -10205,7 +10651,24 @@
 </ct:contentTypeSchema>
 </file>
 
+<file path=customXml/item4.xml><?xml version="1.0" encoding="utf-8"?>
+<?mso-contentType ?>
+<FormTemplates xmlns="http://schemas.microsoft.com/sharepoint/v3/contenttype/forms">
+  <Display>DocumentLibraryForm</Display>
+  <Edit>DocumentLibraryForm</Edit>
+  <New>DocumentLibraryForm</New>
+</FormTemplates>
+</file>
+
 <file path=customXml/itemProps1.xml><?xml version="1.0" encoding="utf-8"?>
+<ds:datastoreItem xmlns:ds="http://schemas.openxmlformats.org/officeDocument/2006/customXml" ds:itemID="{72B7D650-2FAA-4D72-B587-235E59E6AC26}">
+  <ds:schemaRefs>
+    <ds:schemaRef ds:uri="http://schemas.openxmlformats.org/officeDocument/2006/bibliography"/>
+  </ds:schemaRefs>
+</ds:datastoreItem>
+</file>
+
+<file path=customXml/itemProps2.xml><?xml version="1.0" encoding="utf-8"?>
 <ds:datastoreItem xmlns:ds="http://schemas.openxmlformats.org/officeDocument/2006/customXml" ds:itemID="{846B1C81-E993-40E7-BCC5-DA63F0CD945C}">
   <ds:schemaRefs>
     <ds:schemaRef ds:uri="http://schemas.microsoft.com/office/2006/metadata/properties"/>
@@ -10216,23 +10679,7 @@
 </ds:datastoreItem>
 </file>
 
-<file path=customXml/itemProps2.xml><?xml version="1.0" encoding="utf-8"?>
-<ds:datastoreItem xmlns:ds="http://schemas.openxmlformats.org/officeDocument/2006/customXml" ds:itemID="{72B7D650-2FAA-4D72-B587-235E59E6AC26}">
-  <ds:schemaRefs>
-    <ds:schemaRef ds:uri="http://schemas.openxmlformats.org/officeDocument/2006/bibliography"/>
-  </ds:schemaRefs>
-</ds:datastoreItem>
-</file>
-
 <file path=customXml/itemProps3.xml><?xml version="1.0" encoding="utf-8"?>
-<ds:datastoreItem xmlns:ds="http://schemas.openxmlformats.org/officeDocument/2006/customXml" ds:itemID="{C6916C6B-E06E-47CD-A094-BBBE44C5EA8C}">
-  <ds:schemaRefs>
-    <ds:schemaRef ds:uri="http://schemas.microsoft.com/sharepoint/v3/contenttype/forms"/>
-  </ds:schemaRefs>
-</ds:datastoreItem>
-</file>
-
-<file path=customXml/itemProps4.xml><?xml version="1.0" encoding="utf-8"?>
 <ds:datastoreItem xmlns:ds="http://schemas.openxmlformats.org/officeDocument/2006/customXml" ds:itemID="{7FB410C4-6DED-4E94-8F1E-FF9C8071DEDF}">
   <ds:schemaRefs>
     <ds:schemaRef ds:uri="http://schemas.microsoft.com/office/2006/metadata/contentType"/>
@@ -10249,4 +10696,12 @@
     <ds:schemaRef ds:uri="http://schemas.microsoft.com/internal/obd"/>
   </ds:schemaRefs>
 </ds:datastoreItem>
+</file>
+
+<file path=customXml/itemProps4.xml><?xml version="1.0" encoding="utf-8"?>
+<ds:datastoreItem xmlns:ds="http://schemas.openxmlformats.org/officeDocument/2006/customXml" ds:itemID="{C6916C6B-E06E-47CD-A094-BBBE44C5EA8C}">
+  <ds:schemaRefs>
+    <ds:schemaRef ds:uri="http://schemas.microsoft.com/sharepoint/v3/contenttype/forms"/>
+  </ds:schemaRefs>
+</ds:datastoreItem>
 </file>
</xml_diff>